<commit_message>
Add daily care analytics reminders and cloud backup
</commit_message>
<xml_diff>
--- a/HOW_BLOOMCYCLE_WAS_BUILT.docx
+++ b/HOW_BLOOMCYCLE_WAS_BUILT.docx
@@ -93,7 +93,7 @@
         <w:pStyle w:val="ListBullet"/>
       </w:pPr>
       <w:r>
-        <w:t xml:space="preserve">The Web Crypto API hashes the local account password.</w:t>
+        <w:t xml:space="preserve">Firebase Authentication manages email/password accounts and password-reset emails.</w:t>
       </w:r>
     </w:p>
     <w:p>
@@ -101,7 +101,7 @@
         <w:pStyle w:val="ListBullet"/>
       </w:pPr>
       <w:r>
-        <w:t xml:space="preserve">No backend or external database is used in this version.</w:t>
+        <w:t xml:space="preserve">localStorage cycle records are not uploaded to Firebase.</w:t>
       </w:r>
     </w:p>
     <w:p/>
@@ -1006,7 +1006,7 @@
     <w:p/>
     <w:p>
       <w:r>
-        <w:t xml:space="preserve">Three storage keys separate tracking data, login credentials, and the current session:</w:t>
+        <w:t xml:space="preserve">Tracking data uses a base browser storage key:</w:t>
       </w:r>
     </w:p>
     <w:p/>
@@ -1025,34 +1025,62 @@
         <w:t xml:space="preserve">const STORAGE_KEY = 'bloomcycle-data-v1';</w:t>
       </w:r>
     </w:p>
-    <w:p>
-      <w:pPr>
-        <w:shd w:fill="F5F1F8"/>
-        <w:spacing w:before="20" w:after="20" w:line="260" w:lineRule="auto"/>
-        <w:ind w:left="240" w:right="120"/>
-      </w:pPr>
-      <w:r>
-        <w:rPr>
-          <w:rFonts w:ascii="Consolas" w:hAnsi="Consolas"/>
-          <w:sz w:val="19"/>
-          <w:szCs w:val="19"/>
-        </w:rPr>
-        <w:t xml:space="preserve">const AUTH_KEY = 'bloomcycle-auth-v1';</w:t>
-      </w:r>
-    </w:p>
-    <w:p>
-      <w:pPr>
-        <w:shd w:fill="F5F1F8"/>
-        <w:spacing w:before="20" w:after="20" w:line="260" w:lineRule="auto"/>
-        <w:ind w:left="240" w:right="120"/>
-      </w:pPr>
-      <w:r>
-        <w:rPr>
-          <w:rFonts w:ascii="Consolas" w:hAnsi="Consolas"/>
-          <w:sz w:val="19"/>
-          <w:szCs w:val="19"/>
-        </w:rPr>
-        <w:t xml:space="preserve">const SESSION_KEY = 'bloomcycle-session-v1';</w:t>
+    <w:p/>
+    <w:p>
+      <w:r>
+        <w:t xml:space="preserve">After sign-in, the Firebase user ID is added to the key:</w:t>
+      </w:r>
+    </w:p>
+    <w:p/>
+    <w:p>
+      <w:pPr>
+        <w:shd w:fill="F5F1F8"/>
+        <w:spacing w:before="20" w:after="20" w:line="260" w:lineRule="auto"/>
+        <w:ind w:left="240" w:right="120"/>
+      </w:pPr>
+      <w:r>
+        <w:rPr>
+          <w:rFonts w:ascii="Consolas" w:hAnsi="Consolas"/>
+          <w:sz w:val="19"/>
+          <w:szCs w:val="19"/>
+        </w:rPr>
+        <w:t xml:space="preserve">function getUserStorageKey(userId) {</w:t>
+      </w:r>
+    </w:p>
+    <w:p>
+      <w:pPr>
+        <w:shd w:fill="F5F1F8"/>
+        <w:spacing w:before="20" w:after="20" w:line="260" w:lineRule="auto"/>
+        <w:ind w:left="240" w:right="120"/>
+      </w:pPr>
+      <w:r>
+        <w:rPr>
+          <w:rFonts w:ascii="Consolas" w:hAnsi="Consolas"/>
+          <w:sz w:val="19"/>
+          <w:szCs w:val="19"/>
+        </w:rPr>
+        <w:t xml:space="preserve">  return ${STORAGE_KEY}:${userId};</w:t>
+      </w:r>
+    </w:p>
+    <w:p>
+      <w:pPr>
+        <w:shd w:fill="F5F1F8"/>
+        <w:spacing w:before="20" w:after="20" w:line="260" w:lineRule="auto"/>
+        <w:ind w:left="240" w:right="120"/>
+      </w:pPr>
+      <w:r>
+        <w:rPr>
+          <w:rFonts w:ascii="Consolas" w:hAnsi="Consolas"/>
+          <w:sz w:val="19"/>
+          <w:szCs w:val="19"/>
+        </w:rPr>
+        <w:t xml:space="preserve">}</w:t>
+      </w:r>
+    </w:p>
+    <w:p/>
+    <w:p>
+      <w:r>
+        <w:t xml:space="preserve">This prevents two Firebase accounts using the same browser from seeing each other's local cycle records.</w:t>
       </w:r>
     </w:p>
     <w:p/>
@@ -1379,7 +1407,13 @@
     <w:p/>
     <w:p>
       <w:r>
-        <w:t xml:space="preserve">Because there is no backend, data stays in the same browser. Clearing browser data can delete it, and it does not automatically sync to another device.</w:t>
+        <w:t xml:space="preserve">By default, cycle data stays in the same browser. Clearing browser data can delete it. Firebase stores account credentials and sessions, while cycle records are uploaded only when the user chooses cloud backup.</w:t>
+      </w:r>
+    </w:p>
+    <w:p/>
+    <w:p>
+      <w:r>
+        <w:t xml:space="preserve">When cloud backup is enabled, BloomCycle also writes a copy beneath users/{uid}/backups/cycleData in Cloud Firestore. The included security rules require the signed-in user ID to match the document owner. Local tracking remains available when cloud backup is disabled or unavailable.</w:t>
       </w:r>
     </w:p>
     <w:p/>
@@ -2444,13 +2478,13 @@
         <w:pStyle w:val="Heading1"/>
       </w:pPr>
       <w:r>
-        <w:t xml:space="preserve">11. Body Signal Journal</w:t>
-      </w:r>
-    </w:p>
-    <w:p/>
-    <w:p>
-      <w:r>
-        <w:t xml:space="preserve">The journal records cramps, cravings, sleep, energy, acne, headache, mood, and stress. Each entry receives the current date.</w:t>
+        <w:t xml:space="preserve">11. Daily Check-In and Body Signal Journal</w:t>
+      </w:r>
+    </w:p>
+    <w:p/>
+    <w:p>
+      <w:r>
+        <w:t xml:space="preserve">The daily check-in records water, sleep hours, medication completion, mood, flow, symptoms, and notes. The Body Signal Journal adds cramps, cravings, sleep quality, energy, acne, headache, mood, and stress. Each saved check-in receives the current date.</w:t>
       </w:r>
     </w:p>
     <w:p/>
@@ -2481,7 +2515,7 @@
           <w:sz w:val="19"/>
           <w:szCs w:val="19"/>
         </w:rPr>
-        <w:t xml:space="preserve">  const stampedEntry = { ...entry, date: isoDate(new Date()) };</w:t>
+        <w:t xml:space="preserve">  const stampedEntry = { ...entry, ...data.todayLog, date: isoDate(new Date()) };</w:t>
       </w:r>
     </w:p>
     <w:p>
@@ -2541,52 +2575,22 @@
           <w:sz w:val="19"/>
           <w:szCs w:val="19"/>
         </w:rPr>
-        <w:t xml:space="preserve">    journal: [</w:t>
-      </w:r>
-    </w:p>
-    <w:p>
-      <w:pPr>
-        <w:shd w:fill="F5F1F8"/>
-        <w:spacing w:before="20" w:after="20" w:line="260" w:lineRule="auto"/>
-        <w:ind w:left="240" w:right="120"/>
-      </w:pPr>
-      <w:r>
-        <w:rPr>
-          <w:rFonts w:ascii="Consolas" w:hAnsi="Consolas"/>
-          <w:sz w:val="19"/>
-          <w:szCs w:val="19"/>
-        </w:rPr>
-        <w:t xml:space="preserve">      stampedEntry,</w:t>
-      </w:r>
-    </w:p>
-    <w:p>
-      <w:pPr>
-        <w:shd w:fill="F5F1F8"/>
-        <w:spacing w:before="20" w:after="20" w:line="260" w:lineRule="auto"/>
-        <w:ind w:left="240" w:right="120"/>
-      </w:pPr>
-      <w:r>
-        <w:rPr>
-          <w:rFonts w:ascii="Consolas" w:hAnsi="Consolas"/>
-          <w:sz w:val="19"/>
-          <w:szCs w:val="19"/>
-        </w:rPr>
-        <w:t xml:space="preserve">      ...current.journal.filter((item) =&gt; item.date !== stampedEntry.date)</w:t>
-      </w:r>
-    </w:p>
-    <w:p>
-      <w:pPr>
-        <w:shd w:fill="F5F1F8"/>
-        <w:spacing w:before="20" w:after="20" w:line="260" w:lineRule="auto"/>
-        <w:ind w:left="240" w:right="120"/>
-      </w:pPr>
-      <w:r>
-        <w:rPr>
-          <w:rFonts w:ascii="Consolas" w:hAnsi="Consolas"/>
-          <w:sz w:val="19"/>
-          <w:szCs w:val="19"/>
-        </w:rPr>
-        <w:t xml:space="preserve">    ].slice(0, 30)</w:t>
+        <w:t xml:space="preserve">    journal: [stampedEntry, ...current.journal.filter((item) =&gt; item.date !== stampedEntry.date)].slice(0, 90),</w:t>
+      </w:r>
+    </w:p>
+    <w:p>
+      <w:pPr>
+        <w:shd w:fill="F5F1F8"/>
+        <w:spacing w:before="20" w:after="20" w:line="260" w:lineRule="auto"/>
+        <w:ind w:left="240" w:right="120"/>
+      </w:pPr>
+      <w:r>
+        <w:rPr>
+          <w:rFonts w:ascii="Consolas" w:hAnsi="Consolas"/>
+          <w:sz w:val="19"/>
+          <w:szCs w:val="19"/>
+        </w:rPr>
+        <w:t xml:space="preserve">    dailyLogs: [stampedEntry, ...current.dailyLogs.filter((item) =&gt; item.date !== stampedEntry.date)].slice(0, 365)</w:t>
       </w:r>
     </w:p>
     <w:p>
@@ -2622,7 +2626,13 @@
     <w:p/>
     <w:p>
       <w:r>
-        <w:t xml:space="preserve">Only one entry per date is kept, and the journal is limited to the 30 most recent entries.</w:t>
+        <w:t xml:space="preserve">Only one entry per date is kept. Daily logs provide the source data for mood, symptom, sleep, water, and cycle analytics. Multiple saved period-start dates provide measured cycle lengths and a regularity description.</w:t>
+      </w:r>
+    </w:p>
+    <w:p/>
+    <w:p>
+      <w:r>
+        <w:t xml:space="preserve">Reminder schedules use browser notifications while BloomCycle is open. Medication reminders store only the user-entered name and time and never provide dosing advice. PDF reports are generated locally with jsPDF and include the educational disclaimer.</w:t>
       </w:r>
     </w:p>
     <w:p/>
@@ -2908,65 +2918,95 @@
         <w:pStyle w:val="Heading1"/>
       </w:pPr>
       <w:r>
-        <w:t xml:space="preserve">13. Registration and Password Security</w:t>
-      </w:r>
-    </w:p>
-    <w:p/>
-    <w:p>
-      <w:r>
-        <w:t xml:space="preserve">The authentication screen supports registration, login, sign-out, and local account reset. Usernames must contain at least three characters, and passwords must contain at least eight characters.</w:t>
-      </w:r>
-    </w:p>
-    <w:p/>
-    <w:p>
-      <w:r>
-        <w:t xml:space="preserve">The password is salted and hashed with PBKDF2 before being stored:</w:t>
-      </w:r>
-    </w:p>
-    <w:p/>
-    <w:p>
-      <w:pPr>
-        <w:shd w:fill="F5F1F8"/>
-        <w:spacing w:before="20" w:after="20" w:line="260" w:lineRule="auto"/>
-        <w:ind w:left="240" w:right="120"/>
-      </w:pPr>
-      <w:r>
-        <w:rPr>
-          <w:rFonts w:ascii="Consolas" w:hAnsi="Consolas"/>
-          <w:sz w:val="19"/>
-          <w:szCs w:val="19"/>
-        </w:rPr>
-        <w:t xml:space="preserve">async function createCredentials(username, password) {</w:t>
-      </w:r>
-    </w:p>
-    <w:p>
-      <w:pPr>
-        <w:shd w:fill="F5F1F8"/>
-        <w:spacing w:before="20" w:after="20" w:line="260" w:lineRule="auto"/>
-        <w:ind w:left="240" w:right="120"/>
-      </w:pPr>
-      <w:r>
-        <w:rPr>
-          <w:rFonts w:ascii="Consolas" w:hAnsi="Consolas"/>
-          <w:sz w:val="19"/>
-          <w:szCs w:val="19"/>
-        </w:rPr>
-        <w:t xml:space="preserve">  const salt = crypto.getRandomValues(new Uint8Array(16));</w:t>
-      </w:r>
-    </w:p>
-    <w:p>
-      <w:pPr>
-        <w:shd w:fill="F5F1F8"/>
-        <w:spacing w:before="20" w:after="20" w:line="260" w:lineRule="auto"/>
-        <w:ind w:left="240" w:right="120"/>
-      </w:pPr>
-      <w:r>
-        <w:rPr>
-          <w:rFonts w:ascii="Consolas" w:hAnsi="Consolas"/>
-          <w:sz w:val="19"/>
-          <w:szCs w:val="19"/>
-        </w:rPr>
-        <w:t xml:space="preserve">  const hash = await hashPassword(password, salt);</w:t>
+        <w:t xml:space="preserve">13. Registration, Login, and Password Reset</w:t>
+      </w:r>
+    </w:p>
+    <w:p/>
+    <w:p>
+      <w:r>
+        <w:t xml:space="preserve">Registration requires an email, username, and password. Login uses email and password, while the username is saved as the Firebase display name and shown inside BloomCycle.</w:t>
+      </w:r>
+    </w:p>
+    <w:p/>
+    <w:p>
+      <w:r>
+        <w:t xml:space="preserve">Firebase Authentication manages credentials and persistent sessions:</w:t>
+      </w:r>
+    </w:p>
+    <w:p/>
+    <w:p>
+      <w:pPr>
+        <w:shd w:fill="F5F1F8"/>
+        <w:spacing w:before="20" w:after="20" w:line="260" w:lineRule="auto"/>
+        <w:ind w:left="240" w:right="120"/>
+      </w:pPr>
+      <w:r>
+        <w:rPr>
+          <w:rFonts w:ascii="Consolas" w:hAnsi="Consolas"/>
+          <w:sz w:val="19"/>
+          <w:szCs w:val="19"/>
+        </w:rPr>
+        <w:t xml:space="preserve">export async function registerAccount(email, username, password) {</w:t>
+      </w:r>
+    </w:p>
+    <w:p>
+      <w:pPr>
+        <w:shd w:fill="F5F1F8"/>
+        <w:spacing w:before="20" w:after="20" w:line="260" w:lineRule="auto"/>
+        <w:ind w:left="240" w:right="120"/>
+      </w:pPr>
+      <w:r>
+        <w:rPr>
+          <w:rFonts w:ascii="Consolas" w:hAnsi="Consolas"/>
+          <w:sz w:val="19"/>
+          <w:szCs w:val="19"/>
+        </w:rPr>
+        <w:t xml:space="preserve">  const credential = await createUserWithEmailAndPassword(auth, email, password);</w:t>
+      </w:r>
+    </w:p>
+    <w:p>
+      <w:pPr>
+        <w:shd w:fill="F5F1F8"/>
+        <w:spacing w:before="20" w:after="20" w:line="260" w:lineRule="auto"/>
+        <w:ind w:left="240" w:right="120"/>
+      </w:pPr>
+      <w:r>
+        <w:rPr>
+          <w:rFonts w:ascii="Consolas" w:hAnsi="Consolas"/>
+          <w:sz w:val="19"/>
+          <w:szCs w:val="19"/>
+        </w:rPr>
+        <w:t xml:space="preserve">  await updateProfile(credential.user, { displayName: username });</w:t>
+      </w:r>
+    </w:p>
+    <w:p>
+      <w:pPr>
+        <w:shd w:fill="F5F1F8"/>
+        <w:spacing w:before="20" w:after="20" w:line="260" w:lineRule="auto"/>
+        <w:ind w:left="240" w:right="120"/>
+      </w:pPr>
+      <w:r>
+        <w:rPr>
+          <w:rFonts w:ascii="Consolas" w:hAnsi="Consolas"/>
+          <w:sz w:val="19"/>
+          <w:szCs w:val="19"/>
+        </w:rPr>
+        <w:t xml:space="preserve">  return credential.user;</w:t>
+      </w:r>
+    </w:p>
+    <w:p>
+      <w:pPr>
+        <w:shd w:fill="F5F1F8"/>
+        <w:spacing w:before="20" w:after="20" w:line="260" w:lineRule="auto"/>
+        <w:ind w:left="240" w:right="120"/>
+      </w:pPr>
+      <w:r>
+        <w:rPr>
+          <w:rFonts w:ascii="Consolas" w:hAnsi="Consolas"/>
+          <w:sz w:val="19"/>
+          <w:szCs w:val="19"/>
+        </w:rPr>
+        <w:t xml:space="preserve">}</w:t>
       </w:r>
     </w:p>
     <w:p>
@@ -2996,67 +3036,37 @@
           <w:sz w:val="19"/>
           <w:szCs w:val="19"/>
         </w:rPr>
-        <w:t xml:space="preserve">  return {</w:t>
-      </w:r>
-    </w:p>
-    <w:p>
-      <w:pPr>
-        <w:shd w:fill="F5F1F8"/>
-        <w:spacing w:before="20" w:after="20" w:line="260" w:lineRule="auto"/>
-        <w:ind w:left="240" w:right="120"/>
-      </w:pPr>
-      <w:r>
-        <w:rPr>
-          <w:rFonts w:ascii="Consolas" w:hAnsi="Consolas"/>
-          <w:sz w:val="19"/>
-          <w:szCs w:val="19"/>
-        </w:rPr>
-        <w:t xml:space="preserve">    username,</w:t>
-      </w:r>
-    </w:p>
-    <w:p>
-      <w:pPr>
-        <w:shd w:fill="F5F1F8"/>
-        <w:spacing w:before="20" w:after="20" w:line="260" w:lineRule="auto"/>
-        <w:ind w:left="240" w:right="120"/>
-      </w:pPr>
-      <w:r>
-        <w:rPr>
-          <w:rFonts w:ascii="Consolas" w:hAnsi="Consolas"/>
-          <w:sz w:val="19"/>
-          <w:szCs w:val="19"/>
-        </w:rPr>
-        <w:t xml:space="preserve">    salt: arrayBufferToBase64(salt),</w:t>
-      </w:r>
-    </w:p>
-    <w:p>
-      <w:pPr>
-        <w:shd w:fill="F5F1F8"/>
-        <w:spacing w:before="20" w:after="20" w:line="260" w:lineRule="auto"/>
-        <w:ind w:left="240" w:right="120"/>
-      </w:pPr>
-      <w:r>
-        <w:rPr>
-          <w:rFonts w:ascii="Consolas" w:hAnsi="Consolas"/>
-          <w:sz w:val="19"/>
-          <w:szCs w:val="19"/>
-        </w:rPr>
-        <w:t xml:space="preserve">    hash</w:t>
-      </w:r>
-    </w:p>
-    <w:p>
-      <w:pPr>
-        <w:shd w:fill="F5F1F8"/>
-        <w:spacing w:before="20" w:after="20" w:line="260" w:lineRule="auto"/>
-        <w:ind w:left="240" w:right="120"/>
-      </w:pPr>
-      <w:r>
-        <w:rPr>
-          <w:rFonts w:ascii="Consolas" w:hAnsi="Consolas"/>
-          <w:sz w:val="19"/>
-          <w:szCs w:val="19"/>
-        </w:rPr>
-        <w:t xml:space="preserve">  };</w:t>
+        <w:t xml:space="preserve">export async function signInAccount(email, password) {</w:t>
+      </w:r>
+    </w:p>
+    <w:p>
+      <w:pPr>
+        <w:shd w:fill="F5F1F8"/>
+        <w:spacing w:before="20" w:after="20" w:line="260" w:lineRule="auto"/>
+        <w:ind w:left="240" w:right="120"/>
+      </w:pPr>
+      <w:r>
+        <w:rPr>
+          <w:rFonts w:ascii="Consolas" w:hAnsi="Consolas"/>
+          <w:sz w:val="19"/>
+          <w:szCs w:val="19"/>
+        </w:rPr>
+        <w:t xml:space="preserve">  const credential = await signInWithEmailAndPassword(auth, email, password);</w:t>
+      </w:r>
+    </w:p>
+    <w:p>
+      <w:pPr>
+        <w:shd w:fill="F5F1F8"/>
+        <w:spacing w:before="20" w:after="20" w:line="260" w:lineRule="auto"/>
+        <w:ind w:left="240" w:right="120"/>
+      </w:pPr>
+      <w:r>
+        <w:rPr>
+          <w:rFonts w:ascii="Consolas" w:hAnsi="Consolas"/>
+          <w:sz w:val="19"/>
+          <w:szCs w:val="19"/>
+        </w:rPr>
+        <w:t xml:space="preserve">  return credential.user;</w:t>
       </w:r>
     </w:p>
     <w:p>
@@ -3074,6 +3084,131 @@
         <w:t xml:space="preserve">}</w:t>
       </w:r>
     </w:p>
+    <w:p/>
+    <w:p>
+      <w:r>
+        <w:t xml:space="preserve">The Forgot Password form sends a secure recovery email:</w:t>
+      </w:r>
+    </w:p>
+    <w:p/>
+    <w:p>
+      <w:pPr>
+        <w:shd w:fill="F5F1F8"/>
+        <w:spacing w:before="20" w:after="20" w:line="260" w:lineRule="auto"/>
+        <w:ind w:left="240" w:right="120"/>
+      </w:pPr>
+      <w:r>
+        <w:rPr>
+          <w:rFonts w:ascii="Consolas" w:hAnsi="Consolas"/>
+          <w:sz w:val="19"/>
+          <w:szCs w:val="19"/>
+        </w:rPr>
+        <w:t xml:space="preserve">export async function sendResetEmail(email) {</w:t>
+      </w:r>
+    </w:p>
+    <w:p>
+      <w:pPr>
+        <w:shd w:fill="F5F1F8"/>
+        <w:spacing w:before="20" w:after="20" w:line="260" w:lineRule="auto"/>
+        <w:ind w:left="240" w:right="120"/>
+      </w:pPr>
+      <w:r>
+        <w:rPr>
+          <w:rFonts w:ascii="Consolas" w:hAnsi="Consolas"/>
+          <w:sz w:val="19"/>
+          <w:szCs w:val="19"/>
+        </w:rPr>
+        <w:t xml:space="preserve">  await sendPasswordResetEmail(auth, email);</w:t>
+      </w:r>
+    </w:p>
+    <w:p>
+      <w:pPr>
+        <w:shd w:fill="F5F1F8"/>
+        <w:spacing w:before="20" w:after="20" w:line="260" w:lineRule="auto"/>
+        <w:ind w:left="240" w:right="120"/>
+      </w:pPr>
+      <w:r>
+        <w:rPr>
+          <w:rFonts w:ascii="Consolas" w:hAnsi="Consolas"/>
+          <w:sz w:val="19"/>
+          <w:szCs w:val="19"/>
+        </w:rPr>
+        <w:t xml:space="preserve">}</w:t>
+      </w:r>
+    </w:p>
+    <w:p/>
+    <w:p>
+      <w:r>
+        <w:t xml:space="preserve">Firebase handles the reset token and password-change page. BloomCycle uses a neutral success message so the form does not reveal whether an email address has an account.</w:t>
+      </w:r>
+    </w:p>
+    <w:p/>
+    <w:p>
+      <w:r>
+        <w:t xml:space="preserve">Firebase configuration is read from Vite environment variables in .env. The .env.example file documents the required values without containing real project credentials.</w:t>
+      </w:r>
+    </w:p>
+    <w:p/>
+    <w:p>
+      <w:pPr>
+        <w:pStyle w:val="Heading1"/>
+      </w:pPr>
+      <w:r>
+        <w:t xml:space="preserve">14. Private Mode</w:t>
+      </w:r>
+    </w:p>
+    <w:p/>
+    <w:p>
+      <w:r>
+        <w:t xml:space="preserve">Private Mode replaces sensitive words before displaying them on screen:</w:t>
+      </w:r>
+    </w:p>
+    <w:p/>
+    <w:p>
+      <w:pPr>
+        <w:shd w:fill="F5F1F8"/>
+        <w:spacing w:before="20" w:after="20" w:line="260" w:lineRule="auto"/>
+        <w:ind w:left="240" w:right="120"/>
+      </w:pPr>
+      <w:r>
+        <w:rPr>
+          <w:rFonts w:ascii="Consolas" w:hAnsi="Consolas"/>
+          <w:sz w:val="19"/>
+          <w:szCs w:val="19"/>
+        </w:rPr>
+        <w:t xml:space="preserve">const display = (text) =&gt; (</w:t>
+      </w:r>
+    </w:p>
+    <w:p>
+      <w:pPr>
+        <w:shd w:fill="F5F1F8"/>
+        <w:spacing w:before="20" w:after="20" w:line="260" w:lineRule="auto"/>
+        <w:ind w:left="240" w:right="120"/>
+      </w:pPr>
+      <w:r>
+        <w:rPr>
+          <w:rFonts w:ascii="Consolas" w:hAnsi="Consolas"/>
+          <w:sz w:val="19"/>
+          <w:szCs w:val="19"/>
+        </w:rPr>
+        <w:t xml:space="preserve">  data.profile.privateMode ? maskSensitive(text) : text</w:t>
+      </w:r>
+    </w:p>
+    <w:p>
+      <w:pPr>
+        <w:shd w:fill="F5F1F8"/>
+        <w:spacing w:before="20" w:after="20" w:line="260" w:lineRule="auto"/>
+        <w:ind w:left="240" w:right="120"/>
+      </w:pPr>
+      <w:r>
+        <w:rPr>
+          <w:rFonts w:ascii="Consolas" w:hAnsi="Consolas"/>
+          <w:sz w:val="19"/>
+          <w:szCs w:val="19"/>
+        </w:rPr>
+        <w:t xml:space="preserve">);</w:t>
+      </w:r>
+    </w:p>
     <w:p>
       <w:pPr>
         <w:shd w:fill="F5F1F8"/>
@@ -3101,127 +3236,263 @@
           <w:sz w:val="19"/>
           <w:szCs w:val="19"/>
         </w:rPr>
-        <w:t xml:space="preserve">async function hashPassword(password, salt) {</w:t>
-      </w:r>
-    </w:p>
-    <w:p>
-      <w:pPr>
-        <w:shd w:fill="F5F1F8"/>
-        <w:spacing w:before="20" w:after="20" w:line="260" w:lineRule="auto"/>
-        <w:ind w:left="240" w:right="120"/>
-      </w:pPr>
-      <w:r>
-        <w:rPr>
-          <w:rFonts w:ascii="Consolas" w:hAnsi="Consolas"/>
-          <w:sz w:val="19"/>
-          <w:szCs w:val="19"/>
-        </w:rPr>
-        <w:t xml:space="preserve">  const encoder = new TextEncoder();</w:t>
-      </w:r>
-    </w:p>
-    <w:p>
-      <w:pPr>
-        <w:shd w:fill="F5F1F8"/>
-        <w:spacing w:before="20" w:after="20" w:line="260" w:lineRule="auto"/>
-        <w:ind w:left="240" w:right="120"/>
-      </w:pPr>
-      <w:r>
-        <w:rPr>
-          <w:rFonts w:ascii="Consolas" w:hAnsi="Consolas"/>
-          <w:sz w:val="19"/>
-          <w:szCs w:val="19"/>
-        </w:rPr>
-        <w:t xml:space="preserve">  const keyMaterial = await crypto.subtle.importKey(</w:t>
-      </w:r>
-    </w:p>
-    <w:p>
-      <w:pPr>
-        <w:shd w:fill="F5F1F8"/>
-        <w:spacing w:before="20" w:after="20" w:line="260" w:lineRule="auto"/>
-        <w:ind w:left="240" w:right="120"/>
-      </w:pPr>
-      <w:r>
-        <w:rPr>
-          <w:rFonts w:ascii="Consolas" w:hAnsi="Consolas"/>
-          <w:sz w:val="19"/>
-          <w:szCs w:val="19"/>
-        </w:rPr>
-        <w:t xml:space="preserve">    'raw',</w:t>
-      </w:r>
-    </w:p>
-    <w:p>
-      <w:pPr>
-        <w:shd w:fill="F5F1F8"/>
-        <w:spacing w:before="20" w:after="20" w:line="260" w:lineRule="auto"/>
-        <w:ind w:left="240" w:right="120"/>
-      </w:pPr>
-      <w:r>
-        <w:rPr>
-          <w:rFonts w:ascii="Consolas" w:hAnsi="Consolas"/>
-          <w:sz w:val="19"/>
-          <w:szCs w:val="19"/>
-        </w:rPr>
-        <w:t xml:space="preserve">    encoder.encode(password),</w:t>
-      </w:r>
-    </w:p>
-    <w:p>
-      <w:pPr>
-        <w:shd w:fill="F5F1F8"/>
-        <w:spacing w:before="20" w:after="20" w:line="260" w:lineRule="auto"/>
-        <w:ind w:left="240" w:right="120"/>
-      </w:pPr>
-      <w:r>
-        <w:rPr>
-          <w:rFonts w:ascii="Consolas" w:hAnsi="Consolas"/>
-          <w:sz w:val="19"/>
-          <w:szCs w:val="19"/>
-        </w:rPr>
-        <w:t xml:space="preserve">    'PBKDF2',</w:t>
-      </w:r>
-    </w:p>
-    <w:p>
-      <w:pPr>
-        <w:shd w:fill="F5F1F8"/>
-        <w:spacing w:before="20" w:after="20" w:line="260" w:lineRule="auto"/>
-        <w:ind w:left="240" w:right="120"/>
-      </w:pPr>
-      <w:r>
-        <w:rPr>
-          <w:rFonts w:ascii="Consolas" w:hAnsi="Consolas"/>
-          <w:sz w:val="19"/>
-          <w:szCs w:val="19"/>
-        </w:rPr>
-        <w:t xml:space="preserve">    false,</w:t>
-      </w:r>
-    </w:p>
-    <w:p>
-      <w:pPr>
-        <w:shd w:fill="F5F1F8"/>
-        <w:spacing w:before="20" w:after="20" w:line="260" w:lineRule="auto"/>
-        <w:ind w:left="240" w:right="120"/>
-      </w:pPr>
-      <w:r>
-        <w:rPr>
-          <w:rFonts w:ascii="Consolas" w:hAnsi="Consolas"/>
-          <w:sz w:val="19"/>
-          <w:szCs w:val="19"/>
-        </w:rPr>
-        <w:t xml:space="preserve">    ['deriveBits']</w:t>
-      </w:r>
-    </w:p>
-    <w:p>
-      <w:pPr>
-        <w:shd w:fill="F5F1F8"/>
-        <w:spacing w:before="20" w:after="20" w:line="260" w:lineRule="auto"/>
-        <w:ind w:left="240" w:right="120"/>
-      </w:pPr>
-      <w:r>
-        <w:rPr>
-          <w:rFonts w:ascii="Consolas" w:hAnsi="Consolas"/>
-          <w:sz w:val="19"/>
-          <w:szCs w:val="19"/>
-        </w:rPr>
-        <w:t xml:space="preserve">  );</w:t>
+        <w:t xml:space="preserve">function maskSensitive(text) {</w:t>
+      </w:r>
+    </w:p>
+    <w:p>
+      <w:pPr>
+        <w:shd w:fill="F5F1F8"/>
+        <w:spacing w:before="20" w:after="20" w:line="260" w:lineRule="auto"/>
+        <w:ind w:left="240" w:right="120"/>
+      </w:pPr>
+      <w:r>
+        <w:rPr>
+          <w:rFonts w:ascii="Consolas" w:hAnsi="Consolas"/>
+          <w:sz w:val="19"/>
+          <w:szCs w:val="19"/>
+        </w:rPr>
+        <w:t xml:space="preserve">  return String(text)</w:t>
+      </w:r>
+    </w:p>
+    <w:p>
+      <w:pPr>
+        <w:shd w:fill="F5F1F8"/>
+        <w:spacing w:before="20" w:after="20" w:line="260" w:lineRule="auto"/>
+        <w:ind w:left="240" w:right="120"/>
+      </w:pPr>
+      <w:r>
+        <w:rPr>
+          <w:rFonts w:ascii="Consolas" w:hAnsi="Consolas"/>
+          <w:sz w:val="19"/>
+          <w:szCs w:val="19"/>
+        </w:rPr>
+        <w:t xml:space="preserve">    .replace(/period/gi, 'cycle')</w:t>
+      </w:r>
+    </w:p>
+    <w:p>
+      <w:pPr>
+        <w:shd w:fill="F5F1F8"/>
+        <w:spacing w:before="20" w:after="20" w:line="260" w:lineRule="auto"/>
+        <w:ind w:left="240" w:right="120"/>
+      </w:pPr>
+      <w:r>
+        <w:rPr>
+          <w:rFonts w:ascii="Consolas" w:hAnsi="Consolas"/>
+          <w:sz w:val="19"/>
+          <w:szCs w:val="19"/>
+        </w:rPr>
+        <w:t xml:space="preserve">    .replace(/ovulation/gi, 'signal')</w:t>
+      </w:r>
+    </w:p>
+    <w:p>
+      <w:pPr>
+        <w:shd w:fill="F5F1F8"/>
+        <w:spacing w:before="20" w:after="20" w:line="260" w:lineRule="auto"/>
+        <w:ind w:left="240" w:right="120"/>
+      </w:pPr>
+      <w:r>
+        <w:rPr>
+          <w:rFonts w:ascii="Consolas" w:hAnsi="Consolas"/>
+          <w:sz w:val="19"/>
+          <w:szCs w:val="19"/>
+        </w:rPr>
+        <w:t xml:space="preserve">    .replace(/fertile/gi, 'window')</w:t>
+      </w:r>
+    </w:p>
+    <w:p>
+      <w:pPr>
+        <w:shd w:fill="F5F1F8"/>
+        <w:spacing w:before="20" w:after="20" w:line="260" w:lineRule="auto"/>
+        <w:ind w:left="240" w:right="120"/>
+      </w:pPr>
+      <w:r>
+        <w:rPr>
+          <w:rFonts w:ascii="Consolas" w:hAnsi="Consolas"/>
+          <w:sz w:val="19"/>
+          <w:szCs w:val="19"/>
+        </w:rPr>
+        <w:t xml:space="preserve">    .replace(/symptoms/gi, 'signals')</w:t>
+      </w:r>
+    </w:p>
+    <w:p>
+      <w:pPr>
+        <w:shd w:fill="F5F1F8"/>
+        <w:spacing w:before="20" w:after="20" w:line="260" w:lineRule="auto"/>
+        <w:ind w:left="240" w:right="120"/>
+      </w:pPr>
+      <w:r>
+        <w:rPr>
+          <w:rFonts w:ascii="Consolas" w:hAnsi="Consolas"/>
+          <w:sz w:val="19"/>
+          <w:szCs w:val="19"/>
+        </w:rPr>
+        <w:t xml:space="preserve">    .replace(/doctor/gi, 'care');</w:t>
+      </w:r>
+    </w:p>
+    <w:p>
+      <w:pPr>
+        <w:shd w:fill="F5F1F8"/>
+        <w:spacing w:before="20" w:after="20" w:line="260" w:lineRule="auto"/>
+        <w:ind w:left="240" w:right="120"/>
+      </w:pPr>
+      <w:r>
+        <w:rPr>
+          <w:rFonts w:ascii="Consolas" w:hAnsi="Consolas"/>
+          <w:sz w:val="19"/>
+          <w:szCs w:val="19"/>
+        </w:rPr>
+        <w:t xml:space="preserve">}</w:t>
+      </w:r>
+    </w:p>
+    <w:p/>
+    <w:p>
+      <w:r>
+        <w:t xml:space="preserve">This makes on-screen wording less obvious. It does not encrypt saved tracking data.</w:t>
+      </w:r>
+    </w:p>
+    <w:p/>
+    <w:p>
+      <w:pPr>
+        <w:pStyle w:val="Heading1"/>
+      </w:pPr>
+      <w:r>
+        <w:t xml:space="preserve">15. Gynecologist Summary</w:t>
+      </w:r>
+    </w:p>
+    <w:p/>
+    <w:p>
+      <w:r>
+        <w:t xml:space="preserve">The contact section asks for:</w:t>
+      </w:r>
+    </w:p>
+    <w:p/>
+    <w:p>
+      <w:pPr>
+        <w:pStyle w:val="ListBullet"/>
+      </w:pPr>
+      <w:r>
+        <w:t xml:space="preserve">Patient name</w:t>
+      </w:r>
+    </w:p>
+    <w:p>
+      <w:pPr>
+        <w:pStyle w:val="ListBullet"/>
+      </w:pPr>
+      <w:r>
+        <w:t xml:space="preserve">Patient phone</w:t>
+      </w:r>
+    </w:p>
+    <w:p>
+      <w:pPr>
+        <w:pStyle w:val="ListBullet"/>
+      </w:pPr>
+      <w:r>
+        <w:t xml:space="preserve">Patient email</w:t>
+      </w:r>
+    </w:p>
+    <w:p>
+      <w:pPr>
+        <w:pStyle w:val="ListBullet"/>
+      </w:pPr>
+      <w:r>
+        <w:t xml:space="preserve">Reason for visit</w:t>
+      </w:r>
+    </w:p>
+    <w:p/>
+    <w:p>
+      <w:r>
+        <w:t xml:space="preserve">The app combines those fields with cycle information:</w:t>
+      </w:r>
+    </w:p>
+    <w:p/>
+    <w:p>
+      <w:pPr>
+        <w:shd w:fill="F5F1F8"/>
+        <w:spacing w:before="20" w:after="20" w:line="260" w:lineRule="auto"/>
+        <w:ind w:left="240" w:right="120"/>
+      </w:pPr>
+      <w:r>
+        <w:rPr>
+          <w:rFonts w:ascii="Consolas" w:hAnsi="Consolas"/>
+          <w:sz w:val="19"/>
+          <w:szCs w:val="19"/>
+        </w:rPr>
+        <w:t xml:space="preserve">function buildClinicianMessage(data, stats, currentUser = '') {</w:t>
+      </w:r>
+    </w:p>
+    <w:p>
+      <w:pPr>
+        <w:shd w:fill="F5F1F8"/>
+        <w:spacing w:before="20" w:after="20" w:line="260" w:lineRule="auto"/>
+        <w:ind w:left="240" w:right="120"/>
+      </w:pPr>
+      <w:r>
+        <w:rPr>
+          <w:rFonts w:ascii="Consolas" w:hAnsi="Consolas"/>
+          <w:sz w:val="19"/>
+          <w:szCs w:val="19"/>
+        </w:rPr>
+        <w:t xml:space="preserve">  const patientName =</w:t>
+      </w:r>
+    </w:p>
+    <w:p>
+      <w:pPr>
+        <w:shd w:fill="F5F1F8"/>
+        <w:spacing w:before="20" w:after="20" w:line="260" w:lineRule="auto"/>
+        <w:ind w:left="240" w:right="120"/>
+      </w:pPr>
+      <w:r>
+        <w:rPr>
+          <w:rFonts w:ascii="Consolas" w:hAnsi="Consolas"/>
+          <w:sz w:val="19"/>
+          <w:szCs w:val="19"/>
+        </w:rPr>
+        <w:t xml:space="preserve">    data.settings.clinician.patientName?.trim() ||</w:t>
+      </w:r>
+    </w:p>
+    <w:p>
+      <w:pPr>
+        <w:shd w:fill="F5F1F8"/>
+        <w:spacing w:before="20" w:after="20" w:line="260" w:lineRule="auto"/>
+        <w:ind w:left="240" w:right="120"/>
+      </w:pPr>
+      <w:r>
+        <w:rPr>
+          <w:rFonts w:ascii="Consolas" w:hAnsi="Consolas"/>
+          <w:sz w:val="19"/>
+          <w:szCs w:val="19"/>
+        </w:rPr>
+        <w:t xml:space="preserve">    data.settings.patientName?.trim() ||</w:t>
+      </w:r>
+    </w:p>
+    <w:p>
+      <w:pPr>
+        <w:shd w:fill="F5F1F8"/>
+        <w:spacing w:before="20" w:after="20" w:line="260" w:lineRule="auto"/>
+        <w:ind w:left="240" w:right="120"/>
+      </w:pPr>
+      <w:r>
+        <w:rPr>
+          <w:rFonts w:ascii="Consolas" w:hAnsi="Consolas"/>
+          <w:sz w:val="19"/>
+          <w:szCs w:val="19"/>
+        </w:rPr>
+        <w:t xml:space="preserve">    currentUser ||</w:t>
+      </w:r>
+    </w:p>
+    <w:p>
+      <w:pPr>
+        <w:shd w:fill="F5F1F8"/>
+        <w:spacing w:before="20" w:after="20" w:line="260" w:lineRule="auto"/>
+        <w:ind w:left="240" w:right="120"/>
+      </w:pPr>
+      <w:r>
+        <w:rPr>
+          <w:rFonts w:ascii="Consolas" w:hAnsi="Consolas"/>
+          <w:sz w:val="19"/>
+          <w:szCs w:val="19"/>
+        </w:rPr>
+        <w:t xml:space="preserve">    'Patient';</w:t>
       </w:r>
     </w:p>
     <w:p>
@@ -3251,172 +3522,157 @@
           <w:sz w:val="19"/>
           <w:szCs w:val="19"/>
         </w:rPr>
-        <w:t xml:space="preserve">  const bits = await crypto.subtle.deriveBits(</w:t>
-      </w:r>
-    </w:p>
-    <w:p>
-      <w:pPr>
-        <w:shd w:fill="F5F1F8"/>
-        <w:spacing w:before="20" w:after="20" w:line="260" w:lineRule="auto"/>
-        <w:ind w:left="240" w:right="120"/>
-      </w:pPr>
-      <w:r>
-        <w:rPr>
-          <w:rFonts w:ascii="Consolas" w:hAnsi="Consolas"/>
-          <w:sz w:val="19"/>
-          <w:szCs w:val="19"/>
-        </w:rPr>
-        <w:t xml:space="preserve">    {</w:t>
-      </w:r>
-    </w:p>
-    <w:p>
-      <w:pPr>
-        <w:shd w:fill="F5F1F8"/>
-        <w:spacing w:before="20" w:after="20" w:line="260" w:lineRule="auto"/>
-        <w:ind w:left="240" w:right="120"/>
-      </w:pPr>
-      <w:r>
-        <w:rPr>
-          <w:rFonts w:ascii="Consolas" w:hAnsi="Consolas"/>
-          <w:sz w:val="19"/>
-          <w:szCs w:val="19"/>
-        </w:rPr>
-        <w:t xml:space="preserve">      name: 'PBKDF2',</w:t>
-      </w:r>
-    </w:p>
-    <w:p>
-      <w:pPr>
-        <w:shd w:fill="F5F1F8"/>
-        <w:spacing w:before="20" w:after="20" w:line="260" w:lineRule="auto"/>
-        <w:ind w:left="240" w:right="120"/>
-      </w:pPr>
-      <w:r>
-        <w:rPr>
-          <w:rFonts w:ascii="Consolas" w:hAnsi="Consolas"/>
-          <w:sz w:val="19"/>
-          <w:szCs w:val="19"/>
-        </w:rPr>
-        <w:t xml:space="preserve">      salt,</w:t>
-      </w:r>
-    </w:p>
-    <w:p>
-      <w:pPr>
-        <w:shd w:fill="F5F1F8"/>
-        <w:spacing w:before="20" w:after="20" w:line="260" w:lineRule="auto"/>
-        <w:ind w:left="240" w:right="120"/>
-      </w:pPr>
-      <w:r>
-        <w:rPr>
-          <w:rFonts w:ascii="Consolas" w:hAnsi="Consolas"/>
-          <w:sz w:val="19"/>
-          <w:szCs w:val="19"/>
-        </w:rPr>
-        <w:t xml:space="preserve">      iterations: 150000,</w:t>
-      </w:r>
-    </w:p>
-    <w:p>
-      <w:pPr>
-        <w:shd w:fill="F5F1F8"/>
-        <w:spacing w:before="20" w:after="20" w:line="260" w:lineRule="auto"/>
-        <w:ind w:left="240" w:right="120"/>
-      </w:pPr>
-      <w:r>
-        <w:rPr>
-          <w:rFonts w:ascii="Consolas" w:hAnsi="Consolas"/>
-          <w:sz w:val="19"/>
-          <w:szCs w:val="19"/>
-        </w:rPr>
-        <w:t xml:space="preserve">      hash: 'SHA-256'</w:t>
-      </w:r>
-    </w:p>
-    <w:p>
-      <w:pPr>
-        <w:shd w:fill="F5F1F8"/>
-        <w:spacing w:before="20" w:after="20" w:line="260" w:lineRule="auto"/>
-        <w:ind w:left="240" w:right="120"/>
-      </w:pPr>
-      <w:r>
-        <w:rPr>
-          <w:rFonts w:ascii="Consolas" w:hAnsi="Consolas"/>
-          <w:sz w:val="19"/>
-          <w:szCs w:val="19"/>
-        </w:rPr>
-        <w:t xml:space="preserve">    },</w:t>
-      </w:r>
-    </w:p>
-    <w:p>
-      <w:pPr>
-        <w:shd w:fill="F5F1F8"/>
-        <w:spacing w:before="20" w:after="20" w:line="260" w:lineRule="auto"/>
-        <w:ind w:left="240" w:right="120"/>
-      </w:pPr>
-      <w:r>
-        <w:rPr>
-          <w:rFonts w:ascii="Consolas" w:hAnsi="Consolas"/>
-          <w:sz w:val="19"/>
-          <w:szCs w:val="19"/>
-        </w:rPr>
-        <w:t xml:space="preserve">    keyMaterial,</w:t>
-      </w:r>
-    </w:p>
-    <w:p>
-      <w:pPr>
-        <w:shd w:fill="F5F1F8"/>
-        <w:spacing w:before="20" w:after="20" w:line="260" w:lineRule="auto"/>
-        <w:ind w:left="240" w:right="120"/>
-      </w:pPr>
-      <w:r>
-        <w:rPr>
-          <w:rFonts w:ascii="Consolas" w:hAnsi="Consolas"/>
-          <w:sz w:val="19"/>
-          <w:szCs w:val="19"/>
-        </w:rPr>
-        <w:t xml:space="preserve">    256</w:t>
-      </w:r>
-    </w:p>
-    <w:p>
-      <w:pPr>
-        <w:shd w:fill="F5F1F8"/>
-        <w:spacing w:before="20" w:after="20" w:line="260" w:lineRule="auto"/>
-        <w:ind w:left="240" w:right="120"/>
-      </w:pPr>
-      <w:r>
-        <w:rPr>
-          <w:rFonts w:ascii="Consolas" w:hAnsi="Consolas"/>
-          <w:sz w:val="19"/>
-          <w:szCs w:val="19"/>
-        </w:rPr>
-        <w:t xml:space="preserve">  );</w:t>
-      </w:r>
-    </w:p>
-    <w:p>
-      <w:pPr>
-        <w:shd w:fill="F5F1F8"/>
-        <w:spacing w:before="20" w:after="20" w:line="260" w:lineRule="auto"/>
-        <w:ind w:left="240" w:right="120"/>
-      </w:pPr>
-      <w:r>
-        <w:rPr>
-          <w:rFonts w:ascii="Consolas" w:hAnsi="Consolas"/>
-          <w:sz w:val="19"/>
-          <w:szCs w:val="19"/>
-        </w:rPr>
-        <w:t xml:space="preserve"/>
-      </w:r>
-    </w:p>
-    <w:p>
-      <w:pPr>
-        <w:shd w:fill="F5F1F8"/>
-        <w:spacing w:before="20" w:after="20" w:line="260" w:lineRule="auto"/>
-        <w:ind w:left="240" w:right="120"/>
-      </w:pPr>
-      <w:r>
-        <w:rPr>
-          <w:rFonts w:ascii="Consolas" w:hAnsi="Consolas"/>
-          <w:sz w:val="19"/>
-          <w:szCs w:val="19"/>
-        </w:rPr>
-        <w:t xml:space="preserve">  return arrayBufferToBase64(bits);</w:t>
+        <w:t xml:space="preserve">  return [</w:t>
+      </w:r>
+    </w:p>
+    <w:p>
+      <w:pPr>
+        <w:shd w:fill="F5F1F8"/>
+        <w:spacing w:before="20" w:after="20" w:line="260" w:lineRule="auto"/>
+        <w:ind w:left="240" w:right="120"/>
+      </w:pPr>
+      <w:r>
+        <w:rPr>
+          <w:rFonts w:ascii="Consolas" w:hAnsi="Consolas"/>
+          <w:sz w:val="19"/>
+          <w:szCs w:val="19"/>
+        </w:rPr>
+        <w:t xml:space="preserve">    'Hello,',</w:t>
+      </w:r>
+    </w:p>
+    <w:p>
+      <w:pPr>
+        <w:shd w:fill="F5F1F8"/>
+        <w:spacing w:before="20" w:after="20" w:line="260" w:lineRule="auto"/>
+        <w:ind w:left="240" w:right="120"/>
+      </w:pPr>
+      <w:r>
+        <w:rPr>
+          <w:rFonts w:ascii="Consolas" w:hAnsi="Consolas"/>
+          <w:sz w:val="19"/>
+          <w:szCs w:val="19"/>
+        </w:rPr>
+        <w:t xml:space="preserve">    '',</w:t>
+      </w:r>
+    </w:p>
+    <w:p>
+      <w:pPr>
+        <w:shd w:fill="F5F1F8"/>
+        <w:spacing w:before="20" w:after="20" w:line="260" w:lineRule="auto"/>
+        <w:ind w:left="240" w:right="120"/>
+      </w:pPr>
+      <w:r>
+        <w:rPr>
+          <w:rFonts w:ascii="Consolas" w:hAnsi="Consolas"/>
+          <w:sz w:val="19"/>
+          <w:szCs w:val="19"/>
+        </w:rPr>
+        <w:t xml:space="preserve">    'I am sharing a BloomCycle tracking summary for an appointment or care discussion.',</w:t>
+      </w:r>
+    </w:p>
+    <w:p>
+      <w:pPr>
+        <w:shd w:fill="F5F1F8"/>
+        <w:spacing w:before="20" w:after="20" w:line="260" w:lineRule="auto"/>
+        <w:ind w:left="240" w:right="120"/>
+      </w:pPr>
+      <w:r>
+        <w:rPr>
+          <w:rFonts w:ascii="Consolas" w:hAnsi="Consolas"/>
+          <w:sz w:val="19"/>
+          <w:szCs w:val="19"/>
+        </w:rPr>
+        <w:t xml:space="preserve">    Patient name: ${patientName},</w:t>
+      </w:r>
+    </w:p>
+    <w:p>
+      <w:pPr>
+        <w:shd w:fill="F5F1F8"/>
+        <w:spacing w:before="20" w:after="20" w:line="260" w:lineRule="auto"/>
+        <w:ind w:left="240" w:right="120"/>
+      </w:pPr>
+      <w:r>
+        <w:rPr>
+          <w:rFonts w:ascii="Consolas" w:hAnsi="Consolas"/>
+          <w:sz w:val="19"/>
+          <w:szCs w:val="19"/>
+        </w:rPr>
+        <w:t xml:space="preserve">    Patient phone: ${data.settings.clinician.phone || 'Not specified'},</w:t>
+      </w:r>
+    </w:p>
+    <w:p>
+      <w:pPr>
+        <w:shd w:fill="F5F1F8"/>
+        <w:spacing w:before="20" w:after="20" w:line="260" w:lineRule="auto"/>
+        <w:ind w:left="240" w:right="120"/>
+      </w:pPr>
+      <w:r>
+        <w:rPr>
+          <w:rFonts w:ascii="Consolas" w:hAnsi="Consolas"/>
+          <w:sz w:val="19"/>
+          <w:szCs w:val="19"/>
+        </w:rPr>
+        <w:t xml:space="preserve">    Patient email: ${data.settings.clinician.email || 'Not specified'},</w:t>
+      </w:r>
+    </w:p>
+    <w:p>
+      <w:pPr>
+        <w:shd w:fill="F5F1F8"/>
+        <w:spacing w:before="20" w:after="20" w:line="260" w:lineRule="auto"/>
+        <w:ind w:left="240" w:right="120"/>
+      </w:pPr>
+      <w:r>
+        <w:rPr>
+          <w:rFonts w:ascii="Consolas" w:hAnsi="Consolas"/>
+          <w:sz w:val="19"/>
+          <w:szCs w:val="19"/>
+        </w:rPr>
+        <w:t xml:space="preserve">    Reason for visit: ${data.settings.clinician.visitReason || 'Not specified'},</w:t>
+      </w:r>
+    </w:p>
+    <w:p>
+      <w:pPr>
+        <w:shd w:fill="F5F1F8"/>
+        <w:spacing w:before="20" w:after="20" w:line="260" w:lineRule="auto"/>
+        <w:ind w:left="240" w:right="120"/>
+      </w:pPr>
+      <w:r>
+        <w:rPr>
+          <w:rFonts w:ascii="Consolas" w:hAnsi="Consolas"/>
+          <w:sz w:val="19"/>
+          <w:szCs w:val="19"/>
+        </w:rPr>
+        <w:t xml:space="preserve">    '',</w:t>
+      </w:r>
+    </w:p>
+    <w:p>
+      <w:pPr>
+        <w:shd w:fill="F5F1F8"/>
+        <w:spacing w:before="20" w:after="20" w:line="260" w:lineRule="auto"/>
+        <w:ind w:left="240" w:right="120"/>
+      </w:pPr>
+      <w:r>
+        <w:rPr>
+          <w:rFonts w:ascii="Consolas" w:hAnsi="Consolas"/>
+          <w:sz w:val="19"/>
+          <w:szCs w:val="19"/>
+        </w:rPr>
+        <w:t xml:space="preserve">    buildSummary(data, stats, getConfidenceScore(data))</w:t>
+      </w:r>
+    </w:p>
+    <w:p>
+      <w:pPr>
+        <w:shd w:fill="F5F1F8"/>
+        <w:spacing w:before="20" w:after="20" w:line="260" w:lineRule="auto"/>
+        <w:ind w:left="240" w:right="120"/>
+      </w:pPr>
+      <w:r>
+        <w:rPr>
+          <w:rFonts w:ascii="Consolas" w:hAnsi="Consolas"/>
+          <w:sz w:val="19"/>
+          <w:szCs w:val="19"/>
+        </w:rPr>
+        <w:t xml:space="preserve">  ].join('\n');</w:t>
       </w:r>
     </w:p>
     <w:p>
@@ -3437,13 +3693,7 @@
     <w:p/>
     <w:p>
       <w:r>
-        <w:t xml:space="preserve">During login, the entered password is hashed with the stored salt and compared with the saved hash.</w:t>
-      </w:r>
-    </w:p>
-    <w:p/>
-    <w:p>
-      <w:r>
-        <w:t xml:space="preserve">This protects the plain-text password from being stored, but it is local browser protection only. Production security requires a backend, HTTPS, server-side sessions, account recovery, database encryption, rate limiting, and security review.</w:t>
+        <w:t xml:space="preserve">The user can copy the report or open an email draft. No information is automatically sent to a gynecologist.</w:t>
       </w:r>
     </w:p>
     <w:p/>
@@ -3452,200 +3702,82 @@
         <w:pStyle w:val="Heading1"/>
       </w:pPr>
       <w:r>
-        <w:t xml:space="preserve">14. Private Mode</w:t>
-      </w:r>
-    </w:p>
-    <w:p/>
-    <w:p>
-      <w:r>
-        <w:t xml:space="preserve">Private Mode replaces sensitive words before displaying them on screen:</w:t>
-      </w:r>
-    </w:p>
-    <w:p/>
-    <w:p>
-      <w:pPr>
-        <w:shd w:fill="F5F1F8"/>
-        <w:spacing w:before="20" w:after="20" w:line="260" w:lineRule="auto"/>
-        <w:ind w:left="240" w:right="120"/>
-      </w:pPr>
-      <w:r>
-        <w:rPr>
-          <w:rFonts w:ascii="Consolas" w:hAnsi="Consolas"/>
-          <w:sz w:val="19"/>
-          <w:szCs w:val="19"/>
-        </w:rPr>
-        <w:t xml:space="preserve">const display = (text) =&gt; (</w:t>
-      </w:r>
-    </w:p>
-    <w:p>
-      <w:pPr>
-        <w:shd w:fill="F5F1F8"/>
-        <w:spacing w:before="20" w:after="20" w:line="260" w:lineRule="auto"/>
-        <w:ind w:left="240" w:right="120"/>
-      </w:pPr>
-      <w:r>
-        <w:rPr>
-          <w:rFonts w:ascii="Consolas" w:hAnsi="Consolas"/>
-          <w:sz w:val="19"/>
-          <w:szCs w:val="19"/>
-        </w:rPr>
-        <w:t xml:space="preserve">  data.profile.privateMode ? maskSensitive(text) : text</w:t>
-      </w:r>
-    </w:p>
-    <w:p>
-      <w:pPr>
-        <w:shd w:fill="F5F1F8"/>
-        <w:spacing w:before="20" w:after="20" w:line="260" w:lineRule="auto"/>
-        <w:ind w:left="240" w:right="120"/>
-      </w:pPr>
-      <w:r>
-        <w:rPr>
-          <w:rFonts w:ascii="Consolas" w:hAnsi="Consolas"/>
-          <w:sz w:val="19"/>
-          <w:szCs w:val="19"/>
-        </w:rPr>
-        <w:t xml:space="preserve">);</w:t>
-      </w:r>
-    </w:p>
-    <w:p>
-      <w:pPr>
-        <w:shd w:fill="F5F1F8"/>
-        <w:spacing w:before="20" w:after="20" w:line="260" w:lineRule="auto"/>
-        <w:ind w:left="240" w:right="120"/>
-      </w:pPr>
-      <w:r>
-        <w:rPr>
-          <w:rFonts w:ascii="Consolas" w:hAnsi="Consolas"/>
-          <w:sz w:val="19"/>
-          <w:szCs w:val="19"/>
-        </w:rPr>
-        <w:t xml:space="preserve"/>
-      </w:r>
-    </w:p>
-    <w:p>
-      <w:pPr>
-        <w:shd w:fill="F5F1F8"/>
-        <w:spacing w:before="20" w:after="20" w:line="260" w:lineRule="auto"/>
-        <w:ind w:left="240" w:right="120"/>
-      </w:pPr>
-      <w:r>
-        <w:rPr>
-          <w:rFonts w:ascii="Consolas" w:hAnsi="Consolas"/>
-          <w:sz w:val="19"/>
-          <w:szCs w:val="19"/>
-        </w:rPr>
-        <w:t xml:space="preserve">function maskSensitive(text) {</w:t>
-      </w:r>
-    </w:p>
-    <w:p>
-      <w:pPr>
-        <w:shd w:fill="F5F1F8"/>
-        <w:spacing w:before="20" w:after="20" w:line="260" w:lineRule="auto"/>
-        <w:ind w:left="240" w:right="120"/>
-      </w:pPr>
-      <w:r>
-        <w:rPr>
-          <w:rFonts w:ascii="Consolas" w:hAnsi="Consolas"/>
-          <w:sz w:val="19"/>
-          <w:szCs w:val="19"/>
-        </w:rPr>
-        <w:t xml:space="preserve">  return String(text)</w:t>
-      </w:r>
-    </w:p>
-    <w:p>
-      <w:pPr>
-        <w:shd w:fill="F5F1F8"/>
-        <w:spacing w:before="20" w:after="20" w:line="260" w:lineRule="auto"/>
-        <w:ind w:left="240" w:right="120"/>
-      </w:pPr>
-      <w:r>
-        <w:rPr>
-          <w:rFonts w:ascii="Consolas" w:hAnsi="Consolas"/>
-          <w:sz w:val="19"/>
-          <w:szCs w:val="19"/>
-        </w:rPr>
-        <w:t xml:space="preserve">    .replace(/period/gi, 'cycle')</w:t>
-      </w:r>
-    </w:p>
-    <w:p>
-      <w:pPr>
-        <w:shd w:fill="F5F1F8"/>
-        <w:spacing w:before="20" w:after="20" w:line="260" w:lineRule="auto"/>
-        <w:ind w:left="240" w:right="120"/>
-      </w:pPr>
-      <w:r>
-        <w:rPr>
-          <w:rFonts w:ascii="Consolas" w:hAnsi="Consolas"/>
-          <w:sz w:val="19"/>
-          <w:szCs w:val="19"/>
-        </w:rPr>
-        <w:t xml:space="preserve">    .replace(/ovulation/gi, 'signal')</w:t>
-      </w:r>
-    </w:p>
-    <w:p>
-      <w:pPr>
-        <w:shd w:fill="F5F1F8"/>
-        <w:spacing w:before="20" w:after="20" w:line="260" w:lineRule="auto"/>
-        <w:ind w:left="240" w:right="120"/>
-      </w:pPr>
-      <w:r>
-        <w:rPr>
-          <w:rFonts w:ascii="Consolas" w:hAnsi="Consolas"/>
-          <w:sz w:val="19"/>
-          <w:szCs w:val="19"/>
-        </w:rPr>
-        <w:t xml:space="preserve">    .replace(/fertile/gi, 'window')</w:t>
-      </w:r>
-    </w:p>
-    <w:p>
-      <w:pPr>
-        <w:shd w:fill="F5F1F8"/>
-        <w:spacing w:before="20" w:after="20" w:line="260" w:lineRule="auto"/>
-        <w:ind w:left="240" w:right="120"/>
-      </w:pPr>
-      <w:r>
-        <w:rPr>
-          <w:rFonts w:ascii="Consolas" w:hAnsi="Consolas"/>
-          <w:sz w:val="19"/>
-          <w:szCs w:val="19"/>
-        </w:rPr>
-        <w:t xml:space="preserve">    .replace(/symptoms/gi, 'signals')</w:t>
-      </w:r>
-    </w:p>
-    <w:p>
-      <w:pPr>
-        <w:shd w:fill="F5F1F8"/>
-        <w:spacing w:before="20" w:after="20" w:line="260" w:lineRule="auto"/>
-        <w:ind w:left="240" w:right="120"/>
-      </w:pPr>
-      <w:r>
-        <w:rPr>
-          <w:rFonts w:ascii="Consolas" w:hAnsi="Consolas"/>
-          <w:sz w:val="19"/>
-          <w:szCs w:val="19"/>
-        </w:rPr>
-        <w:t xml:space="preserve">    .replace(/doctor/gi, 'care');</w:t>
-      </w:r>
-    </w:p>
-    <w:p>
-      <w:pPr>
-        <w:shd w:fill="F5F1F8"/>
-        <w:spacing w:before="20" w:after="20" w:line="260" w:lineRule="auto"/>
-        <w:ind w:left="240" w:right="120"/>
-      </w:pPr>
-      <w:r>
-        <w:rPr>
-          <w:rFonts w:ascii="Consolas" w:hAnsi="Consolas"/>
-          <w:sz w:val="19"/>
-          <w:szCs w:val="19"/>
-        </w:rPr>
-        <w:t xml:space="preserve">}</w:t>
-      </w:r>
-    </w:p>
-    <w:p/>
-    <w:p>
-      <w:r>
-        <w:t xml:space="preserve">This makes on-screen wording less obvious. It does not encrypt saved tracking data.</w:t>
+        <w:t xml:space="preserve">16. Navigation and Page Components</w:t>
+      </w:r>
+    </w:p>
+    <w:p/>
+    <w:p>
+      <w:r>
+        <w:t xml:space="preserve">The app uses one active-page state instead of a routing library:</w:t>
+      </w:r>
+    </w:p>
+    <w:p/>
+    <w:p>
+      <w:pPr>
+        <w:shd w:fill="F5F1F8"/>
+        <w:spacing w:before="20" w:after="20" w:line="260" w:lineRule="auto"/>
+        <w:ind w:left="240" w:right="120"/>
+      </w:pPr>
+      <w:r>
+        <w:rPr>
+          <w:rFonts w:ascii="Consolas" w:hAnsi="Consolas"/>
+          <w:sz w:val="19"/>
+          <w:szCs w:val="19"/>
+        </w:rPr>
+        <w:t xml:space="preserve">const [activePage, setActivePage] = useState('dashboard');</w:t>
+      </w:r>
+    </w:p>
+    <w:p/>
+    <w:p>
+      <w:r>
+        <w:t xml:space="preserve">The bottom navigation changes this value. React conditionally displays one of these components:</w:t>
+      </w:r>
+    </w:p>
+    <w:p/>
+    <w:p>
+      <w:pPr>
+        <w:pStyle w:val="ListBullet"/>
+      </w:pPr>
+      <w:r>
+        <w:t xml:space="preserve">Dashboard</w:t>
+      </w:r>
+    </w:p>
+    <w:p>
+      <w:pPr>
+        <w:pStyle w:val="ListBullet"/>
+      </w:pPr>
+      <w:r>
+        <w:t xml:space="preserve">CalendarPage</w:t>
+      </w:r>
+    </w:p>
+    <w:p>
+      <w:pPr>
+        <w:pStyle w:val="ListBullet"/>
+      </w:pPr>
+      <w:r>
+        <w:t xml:space="preserve">LogPage</w:t>
+      </w:r>
+    </w:p>
+    <w:p>
+      <w:pPr>
+        <w:pStyle w:val="ListBullet"/>
+      </w:pPr>
+      <w:r>
+        <w:t xml:space="preserve">InsightsPage</w:t>
+      </w:r>
+    </w:p>
+    <w:p>
+      <w:pPr>
+        <w:pStyle w:val="ListBullet"/>
+      </w:pPr>
+      <w:r>
+        <w:t xml:space="preserve">SettingsPage</w:t>
+      </w:r>
+    </w:p>
+    <w:p/>
+    <w:p>
+      <w:r>
+        <w:t xml:space="preserve">This is suitable for the current small app. A larger production version could use React Router.</w:t>
       </w:r>
     </w:p>
     <w:p/>
@@ -3654,13 +3786,13 @@
         <w:pStyle w:val="Heading1"/>
       </w:pPr>
       <w:r>
-        <w:t xml:space="preserve">15. Gynecologist Summary</w:t>
-      </w:r>
-    </w:p>
-    <w:p/>
-    <w:p>
-      <w:r>
-        <w:t xml:space="preserve">The contact section asks for:</w:t>
+        <w:t xml:space="preserve">17. Mobile-First Styling</w:t>
+      </w:r>
+    </w:p>
+    <w:p/>
+    <w:p>
+      <w:r>
+        <w:t xml:space="preserve">The CSS starts with narrow-screen rules and adds wider layouts through media queries. The main design choices are:</w:t>
       </w:r>
     </w:p>
     <w:p/>
@@ -3669,7 +3801,7 @@
         <w:pStyle w:val="ListBullet"/>
       </w:pPr>
       <w:r>
-        <w:t xml:space="preserve">Patient name</w:t>
+        <w:t xml:space="preserve">Fixed bottom navigation for quick thumb access</w:t>
       </w:r>
     </w:p>
     <w:p>
@@ -3677,7 +3809,7 @@
         <w:pStyle w:val="ListBullet"/>
       </w:pPr>
       <w:r>
-        <w:t xml:space="preserve">Patient phone</w:t>
+        <w:t xml:space="preserve">Responsive dashboard grids</w:t>
       </w:r>
     </w:p>
     <w:p>
@@ -3685,7 +3817,7 @@
         <w:pStyle w:val="ListBullet"/>
       </w:pPr>
       <w:r>
-        <w:t xml:space="preserve">Patient email</w:t>
+        <w:t xml:space="preserve">Large input controls and touch targets</w:t>
       </w:r>
     </w:p>
     <w:p>
@@ -3693,305 +3825,29 @@
         <w:pStyle w:val="ListBullet"/>
       </w:pPr>
       <w:r>
-        <w:t xml:space="preserve">Reason for visit</w:t>
-      </w:r>
-    </w:p>
-    <w:p/>
-    <w:p>
-      <w:r>
-        <w:t xml:space="preserve">The app combines those fields with cycle information:</w:t>
-      </w:r>
-    </w:p>
-    <w:p/>
-    <w:p>
-      <w:pPr>
-        <w:shd w:fill="F5F1F8"/>
-        <w:spacing w:before="20" w:after="20" w:line="260" w:lineRule="auto"/>
-        <w:ind w:left="240" w:right="120"/>
-      </w:pPr>
-      <w:r>
-        <w:rPr>
-          <w:rFonts w:ascii="Consolas" w:hAnsi="Consolas"/>
-          <w:sz w:val="19"/>
-          <w:szCs w:val="19"/>
-        </w:rPr>
-        <w:t xml:space="preserve">function buildClinicianMessage(data, stats, currentUser = '') {</w:t>
-      </w:r>
-    </w:p>
-    <w:p>
-      <w:pPr>
-        <w:shd w:fill="F5F1F8"/>
-        <w:spacing w:before="20" w:after="20" w:line="260" w:lineRule="auto"/>
-        <w:ind w:left="240" w:right="120"/>
-      </w:pPr>
-      <w:r>
-        <w:rPr>
-          <w:rFonts w:ascii="Consolas" w:hAnsi="Consolas"/>
-          <w:sz w:val="19"/>
-          <w:szCs w:val="19"/>
-        </w:rPr>
-        <w:t xml:space="preserve">  const patientName =</w:t>
-      </w:r>
-    </w:p>
-    <w:p>
-      <w:pPr>
-        <w:shd w:fill="F5F1F8"/>
-        <w:spacing w:before="20" w:after="20" w:line="260" w:lineRule="auto"/>
-        <w:ind w:left="240" w:right="120"/>
-      </w:pPr>
-      <w:r>
-        <w:rPr>
-          <w:rFonts w:ascii="Consolas" w:hAnsi="Consolas"/>
-          <w:sz w:val="19"/>
-          <w:szCs w:val="19"/>
-        </w:rPr>
-        <w:t xml:space="preserve">    data.settings.clinician.patientName?.trim() ||</w:t>
-      </w:r>
-    </w:p>
-    <w:p>
-      <w:pPr>
-        <w:shd w:fill="F5F1F8"/>
-        <w:spacing w:before="20" w:after="20" w:line="260" w:lineRule="auto"/>
-        <w:ind w:left="240" w:right="120"/>
-      </w:pPr>
-      <w:r>
-        <w:rPr>
-          <w:rFonts w:ascii="Consolas" w:hAnsi="Consolas"/>
-          <w:sz w:val="19"/>
-          <w:szCs w:val="19"/>
-        </w:rPr>
-        <w:t xml:space="preserve">    data.settings.patientName?.trim() ||</w:t>
-      </w:r>
-    </w:p>
-    <w:p>
-      <w:pPr>
-        <w:shd w:fill="F5F1F8"/>
-        <w:spacing w:before="20" w:after="20" w:line="260" w:lineRule="auto"/>
-        <w:ind w:left="240" w:right="120"/>
-      </w:pPr>
-      <w:r>
-        <w:rPr>
-          <w:rFonts w:ascii="Consolas" w:hAnsi="Consolas"/>
-          <w:sz w:val="19"/>
-          <w:szCs w:val="19"/>
-        </w:rPr>
-        <w:t xml:space="preserve">    currentUser ||</w:t>
-      </w:r>
-    </w:p>
-    <w:p>
-      <w:pPr>
-        <w:shd w:fill="F5F1F8"/>
-        <w:spacing w:before="20" w:after="20" w:line="260" w:lineRule="auto"/>
-        <w:ind w:left="240" w:right="120"/>
-      </w:pPr>
-      <w:r>
-        <w:rPr>
-          <w:rFonts w:ascii="Consolas" w:hAnsi="Consolas"/>
-          <w:sz w:val="19"/>
-          <w:szCs w:val="19"/>
-        </w:rPr>
-        <w:t xml:space="preserve">    'Patient';</w:t>
-      </w:r>
-    </w:p>
-    <w:p>
-      <w:pPr>
-        <w:shd w:fill="F5F1F8"/>
-        <w:spacing w:before="20" w:after="20" w:line="260" w:lineRule="auto"/>
-        <w:ind w:left="240" w:right="120"/>
-      </w:pPr>
-      <w:r>
-        <w:rPr>
-          <w:rFonts w:ascii="Consolas" w:hAnsi="Consolas"/>
-          <w:sz w:val="19"/>
-          <w:szCs w:val="19"/>
-        </w:rPr>
-        <w:t xml:space="preserve"/>
-      </w:r>
-    </w:p>
-    <w:p>
-      <w:pPr>
-        <w:shd w:fill="F5F1F8"/>
-        <w:spacing w:before="20" w:after="20" w:line="260" w:lineRule="auto"/>
-        <w:ind w:left="240" w:right="120"/>
-      </w:pPr>
-      <w:r>
-        <w:rPr>
-          <w:rFonts w:ascii="Consolas" w:hAnsi="Consolas"/>
-          <w:sz w:val="19"/>
-          <w:szCs w:val="19"/>
-        </w:rPr>
-        <w:t xml:space="preserve">  return [</w:t>
-      </w:r>
-    </w:p>
-    <w:p>
-      <w:pPr>
-        <w:shd w:fill="F5F1F8"/>
-        <w:spacing w:before="20" w:after="20" w:line="260" w:lineRule="auto"/>
-        <w:ind w:left="240" w:right="120"/>
-      </w:pPr>
-      <w:r>
-        <w:rPr>
-          <w:rFonts w:ascii="Consolas" w:hAnsi="Consolas"/>
-          <w:sz w:val="19"/>
-          <w:szCs w:val="19"/>
-        </w:rPr>
-        <w:t xml:space="preserve">    'Hello,',</w:t>
-      </w:r>
-    </w:p>
-    <w:p>
-      <w:pPr>
-        <w:shd w:fill="F5F1F8"/>
-        <w:spacing w:before="20" w:after="20" w:line="260" w:lineRule="auto"/>
-        <w:ind w:left="240" w:right="120"/>
-      </w:pPr>
-      <w:r>
-        <w:rPr>
-          <w:rFonts w:ascii="Consolas" w:hAnsi="Consolas"/>
-          <w:sz w:val="19"/>
-          <w:szCs w:val="19"/>
-        </w:rPr>
-        <w:t xml:space="preserve">    '',</w:t>
-      </w:r>
-    </w:p>
-    <w:p>
-      <w:pPr>
-        <w:shd w:fill="F5F1F8"/>
-        <w:spacing w:before="20" w:after="20" w:line="260" w:lineRule="auto"/>
-        <w:ind w:left="240" w:right="120"/>
-      </w:pPr>
-      <w:r>
-        <w:rPr>
-          <w:rFonts w:ascii="Consolas" w:hAnsi="Consolas"/>
-          <w:sz w:val="19"/>
-          <w:szCs w:val="19"/>
-        </w:rPr>
-        <w:t xml:space="preserve">    'I am sharing a BloomCycle tracking summary for an appointment or care discussion.',</w:t>
-      </w:r>
-    </w:p>
-    <w:p>
-      <w:pPr>
-        <w:shd w:fill="F5F1F8"/>
-        <w:spacing w:before="20" w:after="20" w:line="260" w:lineRule="auto"/>
-        <w:ind w:left="240" w:right="120"/>
-      </w:pPr>
-      <w:r>
-        <w:rPr>
-          <w:rFonts w:ascii="Consolas" w:hAnsi="Consolas"/>
-          <w:sz w:val="19"/>
-          <w:szCs w:val="19"/>
-        </w:rPr>
-        <w:t xml:space="preserve">    Patient name: ${patientName},</w:t>
-      </w:r>
-    </w:p>
-    <w:p>
-      <w:pPr>
-        <w:shd w:fill="F5F1F8"/>
-        <w:spacing w:before="20" w:after="20" w:line="260" w:lineRule="auto"/>
-        <w:ind w:left="240" w:right="120"/>
-      </w:pPr>
-      <w:r>
-        <w:rPr>
-          <w:rFonts w:ascii="Consolas" w:hAnsi="Consolas"/>
-          <w:sz w:val="19"/>
-          <w:szCs w:val="19"/>
-        </w:rPr>
-        <w:t xml:space="preserve">    Patient phone: ${data.settings.clinician.phone || 'Not specified'},</w:t>
-      </w:r>
-    </w:p>
-    <w:p>
-      <w:pPr>
-        <w:shd w:fill="F5F1F8"/>
-        <w:spacing w:before="20" w:after="20" w:line="260" w:lineRule="auto"/>
-        <w:ind w:left="240" w:right="120"/>
-      </w:pPr>
-      <w:r>
-        <w:rPr>
-          <w:rFonts w:ascii="Consolas" w:hAnsi="Consolas"/>
-          <w:sz w:val="19"/>
-          <w:szCs w:val="19"/>
-        </w:rPr>
-        <w:t xml:space="preserve">    Patient email: ${data.settings.clinician.email || 'Not specified'},</w:t>
-      </w:r>
-    </w:p>
-    <w:p>
-      <w:pPr>
-        <w:shd w:fill="F5F1F8"/>
-        <w:spacing w:before="20" w:after="20" w:line="260" w:lineRule="auto"/>
-        <w:ind w:left="240" w:right="120"/>
-      </w:pPr>
-      <w:r>
-        <w:rPr>
-          <w:rFonts w:ascii="Consolas" w:hAnsi="Consolas"/>
-          <w:sz w:val="19"/>
-          <w:szCs w:val="19"/>
-        </w:rPr>
-        <w:t xml:space="preserve">    Reason for visit: ${data.settings.clinician.visitReason || 'Not specified'},</w:t>
-      </w:r>
-    </w:p>
-    <w:p>
-      <w:pPr>
-        <w:shd w:fill="F5F1F8"/>
-        <w:spacing w:before="20" w:after="20" w:line="260" w:lineRule="auto"/>
-        <w:ind w:left="240" w:right="120"/>
-      </w:pPr>
-      <w:r>
-        <w:rPr>
-          <w:rFonts w:ascii="Consolas" w:hAnsi="Consolas"/>
-          <w:sz w:val="19"/>
-          <w:szCs w:val="19"/>
-        </w:rPr>
-        <w:t xml:space="preserve">    '',</w:t>
-      </w:r>
-    </w:p>
-    <w:p>
-      <w:pPr>
-        <w:shd w:fill="F5F1F8"/>
-        <w:spacing w:before="20" w:after="20" w:line="260" w:lineRule="auto"/>
-        <w:ind w:left="240" w:right="120"/>
-      </w:pPr>
-      <w:r>
-        <w:rPr>
-          <w:rFonts w:ascii="Consolas" w:hAnsi="Consolas"/>
-          <w:sz w:val="19"/>
-          <w:szCs w:val="19"/>
-        </w:rPr>
-        <w:t xml:space="preserve">    buildSummary(data, stats, getConfidenceScore(data))</w:t>
-      </w:r>
-    </w:p>
-    <w:p>
-      <w:pPr>
-        <w:shd w:fill="F5F1F8"/>
-        <w:spacing w:before="20" w:after="20" w:line="260" w:lineRule="auto"/>
-        <w:ind w:left="240" w:right="120"/>
-      </w:pPr>
-      <w:r>
-        <w:rPr>
-          <w:rFonts w:ascii="Consolas" w:hAnsi="Consolas"/>
-          <w:sz w:val="19"/>
-          <w:szCs w:val="19"/>
-        </w:rPr>
-        <w:t xml:space="preserve">  ].join('\n');</w:t>
-      </w:r>
-    </w:p>
-    <w:p>
-      <w:pPr>
-        <w:shd w:fill="F5F1F8"/>
-        <w:spacing w:before="20" w:after="20" w:line="260" w:lineRule="auto"/>
-        <w:ind w:left="240" w:right="120"/>
-      </w:pPr>
-      <w:r>
-        <w:rPr>
-          <w:rFonts w:ascii="Consolas" w:hAnsi="Consolas"/>
-          <w:sz w:val="19"/>
-          <w:szCs w:val="19"/>
-        </w:rPr>
-        <w:t xml:space="preserve">}</w:t>
-      </w:r>
-    </w:p>
-    <w:p/>
-    <w:p>
-      <w:r>
-        <w:t xml:space="preserve">The user can copy the report or open an email draft. No information is automatically sent to a gynecologist.</w:t>
+        <w:t xml:space="preserve">Blush, lavender, cream, sage, and deep-purple colors</w:t>
+      </w:r>
+    </w:p>
+    <w:p>
+      <w:pPr>
+        <w:pStyle w:val="ListBullet"/>
+      </w:pPr>
+      <w:r>
+        <w:t xml:space="preserve">Rounded panels with restrained shadows</w:t>
+      </w:r>
+    </w:p>
+    <w:p>
+      <w:pPr>
+        <w:pStyle w:val="ListBullet"/>
+      </w:pPr>
+      <w:r>
+        <w:t xml:space="preserve">Clear focus states and readable contrast</w:t>
+      </w:r>
+    </w:p>
+    <w:p/>
+    <w:p>
+      <w:r>
+        <w:t xml:space="preserve">The custom BloomCycle logo is rendered by the reusable BloomLogo React component, so the same branding appears on the login screen and inside the app.</w:t>
       </w:r>
     </w:p>
     <w:p/>
@@ -4000,82 +3856,81 @@
         <w:pStyle w:val="Heading1"/>
       </w:pPr>
       <w:r>
-        <w:t xml:space="preserve">16. Navigation and Page Components</w:t>
-      </w:r>
-    </w:p>
-    <w:p/>
-    <w:p>
-      <w:r>
-        <w:t xml:space="preserve">The app uses one active-page state instead of a routing library:</w:t>
-      </w:r>
-    </w:p>
-    <w:p/>
-    <w:p>
-      <w:pPr>
-        <w:shd w:fill="F5F1F8"/>
-        <w:spacing w:before="20" w:after="20" w:line="260" w:lineRule="auto"/>
-        <w:ind w:left="240" w:right="120"/>
-      </w:pPr>
-      <w:r>
-        <w:rPr>
-          <w:rFonts w:ascii="Consolas" w:hAnsi="Consolas"/>
-          <w:sz w:val="19"/>
-          <w:szCs w:val="19"/>
-        </w:rPr>
-        <w:t xml:space="preserve">const [activePage, setActivePage] = useState('dashboard');</w:t>
-      </w:r>
-    </w:p>
-    <w:p/>
-    <w:p>
-      <w:r>
-        <w:t xml:space="preserve">The bottom navigation changes this value. React conditionally displays one of these components:</w:t>
-      </w:r>
-    </w:p>
-    <w:p/>
-    <w:p>
-      <w:pPr>
-        <w:pStyle w:val="ListBullet"/>
-      </w:pPr>
-      <w:r>
-        <w:t xml:space="preserve">Dashboard</w:t>
-      </w:r>
-    </w:p>
-    <w:p>
-      <w:pPr>
-        <w:pStyle w:val="ListBullet"/>
-      </w:pPr>
-      <w:r>
-        <w:t xml:space="preserve">CalendarPage</w:t>
-      </w:r>
-    </w:p>
-    <w:p>
-      <w:pPr>
-        <w:pStyle w:val="ListBullet"/>
-      </w:pPr>
-      <w:r>
-        <w:t xml:space="preserve">LogPage</w:t>
-      </w:r>
-    </w:p>
-    <w:p>
-      <w:pPr>
-        <w:pStyle w:val="ListBullet"/>
-      </w:pPr>
-      <w:r>
-        <w:t xml:space="preserve">InsightsPage</w:t>
-      </w:r>
-    </w:p>
-    <w:p>
-      <w:pPr>
-        <w:pStyle w:val="ListBullet"/>
-      </w:pPr>
-      <w:r>
-        <w:t xml:space="preserve">SettingsPage</w:t>
-      </w:r>
-    </w:p>
-    <w:p/>
-    <w:p>
-      <w:r>
-        <w:t xml:space="preserve">This is suitable for the current small app. A larger production version could use React Router.</w:t>
+        <w:t xml:space="preserve">18. Running the App</w:t>
+      </w:r>
+    </w:p>
+    <w:p/>
+    <w:p>
+      <w:r>
+        <w:t xml:space="preserve">Open PowerShell or Command Prompt and run:</w:t>
+      </w:r>
+    </w:p>
+    <w:p/>
+    <w:p>
+      <w:pPr>
+        <w:shd w:fill="F5F1F8"/>
+        <w:spacing w:before="20" w:after="20" w:line="260" w:lineRule="auto"/>
+        <w:ind w:left="240" w:right="120"/>
+      </w:pPr>
+      <w:r>
+        <w:rPr>
+          <w:rFonts w:ascii="Consolas" w:hAnsi="Consolas"/>
+          <w:sz w:val="19"/>
+          <w:szCs w:val="19"/>
+        </w:rPr>
+        <w:t xml:space="preserve">cd "C:\Users\Agatha nweze\Documents\MY_CODING_WORK\BloomCycle"</w:t>
+      </w:r>
+    </w:p>
+    <w:p>
+      <w:pPr>
+        <w:shd w:fill="F5F1F8"/>
+        <w:spacing w:before="20" w:after="20" w:line="260" w:lineRule="auto"/>
+        <w:ind w:left="240" w:right="120"/>
+      </w:pPr>
+      <w:r>
+        <w:rPr>
+          <w:rFonts w:ascii="Consolas" w:hAnsi="Consolas"/>
+          <w:sz w:val="19"/>
+          <w:szCs w:val="19"/>
+        </w:rPr>
+        <w:t xml:space="preserve">npm install</w:t>
+      </w:r>
+    </w:p>
+    <w:p>
+      <w:pPr>
+        <w:shd w:fill="F5F1F8"/>
+        <w:spacing w:before="20" w:after="20" w:line="260" w:lineRule="auto"/>
+        <w:ind w:left="240" w:right="120"/>
+      </w:pPr>
+      <w:r>
+        <w:rPr>
+          <w:rFonts w:ascii="Consolas" w:hAnsi="Consolas"/>
+          <w:sz w:val="19"/>
+          <w:szCs w:val="19"/>
+        </w:rPr>
+        <w:t xml:space="preserve">npm run dev</w:t>
+      </w:r>
+    </w:p>
+    <w:p/>
+    <w:p>
+      <w:r>
+        <w:t xml:space="preserve">Then open:</w:t>
+      </w:r>
+    </w:p>
+    <w:p/>
+    <w:p>
+      <w:pPr>
+        <w:shd w:fill="F5F1F8"/>
+        <w:spacing w:before="20" w:after="20" w:line="260" w:lineRule="auto"/>
+        <w:ind w:left="240" w:right="120"/>
+      </w:pPr>
+      <w:r>
+        <w:rPr>
+          <w:rFonts w:ascii="Consolas" w:hAnsi="Consolas"/>
+          <w:sz w:val="19"/>
+          <w:szCs w:val="19"/>
+        </w:rPr>
+        <w:t xml:space="preserve">http://localhost:5173/</w:t>
       </w:r>
     </w:p>
     <w:p/>
@@ -4084,68 +3939,51 @@
         <w:pStyle w:val="Heading1"/>
       </w:pPr>
       <w:r>
-        <w:t xml:space="preserve">17. Mobile-First Styling</w:t>
-      </w:r>
-    </w:p>
-    <w:p/>
-    <w:p>
-      <w:r>
-        <w:t xml:space="preserve">The CSS starts with narrow-screen rules and adds wider layouts through media queries. The main design choices are:</w:t>
-      </w:r>
-    </w:p>
-    <w:p/>
-    <w:p>
-      <w:pPr>
-        <w:pStyle w:val="ListBullet"/>
-      </w:pPr>
-      <w:r>
-        <w:t xml:space="preserve">Fixed bottom navigation for quick thumb access</w:t>
-      </w:r>
-    </w:p>
-    <w:p>
-      <w:pPr>
-        <w:pStyle w:val="ListBullet"/>
-      </w:pPr>
-      <w:r>
-        <w:t xml:space="preserve">Responsive dashboard grids</w:t>
-      </w:r>
-    </w:p>
-    <w:p>
-      <w:pPr>
-        <w:pStyle w:val="ListBullet"/>
-      </w:pPr>
-      <w:r>
-        <w:t xml:space="preserve">Large input controls and touch targets</w:t>
-      </w:r>
-    </w:p>
-    <w:p>
-      <w:pPr>
-        <w:pStyle w:val="ListBullet"/>
-      </w:pPr>
-      <w:r>
-        <w:t xml:space="preserve">Blush, lavender, cream, sage, and deep-purple colors</w:t>
-      </w:r>
-    </w:p>
-    <w:p>
-      <w:pPr>
-        <w:pStyle w:val="ListBullet"/>
-      </w:pPr>
-      <w:r>
-        <w:t xml:space="preserve">Rounded panels with restrained shadows</w:t>
-      </w:r>
-    </w:p>
-    <w:p>
-      <w:pPr>
-        <w:pStyle w:val="ListBullet"/>
-      </w:pPr>
-      <w:r>
-        <w:t xml:space="preserve">Clear focus states and readable contrast</w:t>
-      </w:r>
-    </w:p>
-    <w:p/>
-    <w:p>
-      <w:r>
-        <w:t xml:space="preserve">The custom BloomCycle logo is rendered by the reusable BloomLogo React component, so the same branding appears on the login screen and inside the app.</w:t>
+        <w:t xml:space="preserve">19. Creating a Production Build</w:t>
+      </w:r>
+    </w:p>
+    <w:p/>
+    <w:p>
+      <w:r>
+        <w:t xml:space="preserve">Run:</w:t>
+      </w:r>
+    </w:p>
+    <w:p/>
+    <w:p>
+      <w:pPr>
+        <w:shd w:fill="F5F1F8"/>
+        <w:spacing w:before="20" w:after="20" w:line="260" w:lineRule="auto"/>
+        <w:ind w:left="240" w:right="120"/>
+      </w:pPr>
+      <w:r>
+        <w:rPr>
+          <w:rFonts w:ascii="Consolas" w:hAnsi="Consolas"/>
+          <w:sz w:val="19"/>
+          <w:szCs w:val="19"/>
+        </w:rPr>
+        <w:t xml:space="preserve">npm run build</w:t>
+      </w:r>
+    </w:p>
+    <w:p/>
+    <w:p>
+      <w:r>
+        <w:t xml:space="preserve">Vite creates the production files in the dist folder. To test that build locally, run:</w:t>
+      </w:r>
+    </w:p>
+    <w:p/>
+    <w:p>
+      <w:pPr>
+        <w:shd w:fill="F5F1F8"/>
+        <w:spacing w:before="20" w:after="20" w:line="260" w:lineRule="auto"/>
+        <w:ind w:left="240" w:right="120"/>
+      </w:pPr>
+      <w:r>
+        <w:rPr>
+          <w:rFonts w:ascii="Consolas" w:hAnsi="Consolas"/>
+          <w:sz w:val="19"/>
+          <w:szCs w:val="19"/>
+        </w:rPr>
+        <w:t xml:space="preserve">npm run preview</w:t>
       </w:r>
     </w:p>
     <w:p/>
@@ -4154,142 +3992,6 @@
         <w:pStyle w:val="Heading1"/>
       </w:pPr>
       <w:r>
-        <w:t xml:space="preserve">18. Running the App</w:t>
-      </w:r>
-    </w:p>
-    <w:p/>
-    <w:p>
-      <w:r>
-        <w:t xml:space="preserve">Open PowerShell or Command Prompt and run:</w:t>
-      </w:r>
-    </w:p>
-    <w:p/>
-    <w:p>
-      <w:pPr>
-        <w:shd w:fill="F5F1F8"/>
-        <w:spacing w:before="20" w:after="20" w:line="260" w:lineRule="auto"/>
-        <w:ind w:left="240" w:right="120"/>
-      </w:pPr>
-      <w:r>
-        <w:rPr>
-          <w:rFonts w:ascii="Consolas" w:hAnsi="Consolas"/>
-          <w:sz w:val="19"/>
-          <w:szCs w:val="19"/>
-        </w:rPr>
-        <w:t xml:space="preserve">cd "C:\Users\Agatha nweze\Documents\MY_CODING_WORK\BloomCycle"</w:t>
-      </w:r>
-    </w:p>
-    <w:p>
-      <w:pPr>
-        <w:shd w:fill="F5F1F8"/>
-        <w:spacing w:before="20" w:after="20" w:line="260" w:lineRule="auto"/>
-        <w:ind w:left="240" w:right="120"/>
-      </w:pPr>
-      <w:r>
-        <w:rPr>
-          <w:rFonts w:ascii="Consolas" w:hAnsi="Consolas"/>
-          <w:sz w:val="19"/>
-          <w:szCs w:val="19"/>
-        </w:rPr>
-        <w:t xml:space="preserve">npm install</w:t>
-      </w:r>
-    </w:p>
-    <w:p>
-      <w:pPr>
-        <w:shd w:fill="F5F1F8"/>
-        <w:spacing w:before="20" w:after="20" w:line="260" w:lineRule="auto"/>
-        <w:ind w:left="240" w:right="120"/>
-      </w:pPr>
-      <w:r>
-        <w:rPr>
-          <w:rFonts w:ascii="Consolas" w:hAnsi="Consolas"/>
-          <w:sz w:val="19"/>
-          <w:szCs w:val="19"/>
-        </w:rPr>
-        <w:t xml:space="preserve">npm run dev</w:t>
-      </w:r>
-    </w:p>
-    <w:p/>
-    <w:p>
-      <w:r>
-        <w:t xml:space="preserve">Then open:</w:t>
-      </w:r>
-    </w:p>
-    <w:p/>
-    <w:p>
-      <w:pPr>
-        <w:shd w:fill="F5F1F8"/>
-        <w:spacing w:before="20" w:after="20" w:line="260" w:lineRule="auto"/>
-        <w:ind w:left="240" w:right="120"/>
-      </w:pPr>
-      <w:r>
-        <w:rPr>
-          <w:rFonts w:ascii="Consolas" w:hAnsi="Consolas"/>
-          <w:sz w:val="19"/>
-          <w:szCs w:val="19"/>
-        </w:rPr>
-        <w:t xml:space="preserve">http://localhost:5173/</w:t>
-      </w:r>
-    </w:p>
-    <w:p/>
-    <w:p>
-      <w:pPr>
-        <w:pStyle w:val="Heading1"/>
-      </w:pPr>
-      <w:r>
-        <w:t xml:space="preserve">19. Creating a Production Build</w:t>
-      </w:r>
-    </w:p>
-    <w:p/>
-    <w:p>
-      <w:r>
-        <w:t xml:space="preserve">Run:</w:t>
-      </w:r>
-    </w:p>
-    <w:p/>
-    <w:p>
-      <w:pPr>
-        <w:shd w:fill="F5F1F8"/>
-        <w:spacing w:before="20" w:after="20" w:line="260" w:lineRule="auto"/>
-        <w:ind w:left="240" w:right="120"/>
-      </w:pPr>
-      <w:r>
-        <w:rPr>
-          <w:rFonts w:ascii="Consolas" w:hAnsi="Consolas"/>
-          <w:sz w:val="19"/>
-          <w:szCs w:val="19"/>
-        </w:rPr>
-        <w:t xml:space="preserve">npm run build</w:t>
-      </w:r>
-    </w:p>
-    <w:p/>
-    <w:p>
-      <w:r>
-        <w:t xml:space="preserve">Vite creates the production files in the dist folder. To test that build locally, run:</w:t>
-      </w:r>
-    </w:p>
-    <w:p/>
-    <w:p>
-      <w:pPr>
-        <w:shd w:fill="F5F1F8"/>
-        <w:spacing w:before="20" w:after="20" w:line="260" w:lineRule="auto"/>
-        <w:ind w:left="240" w:right="120"/>
-      </w:pPr>
-      <w:r>
-        <w:rPr>
-          <w:rFonts w:ascii="Consolas" w:hAnsi="Consolas"/>
-          <w:sz w:val="19"/>
-          <w:szCs w:val="19"/>
-        </w:rPr>
-        <w:t xml:space="preserve">npm run preview</w:t>
-      </w:r>
-    </w:p>
-    <w:p/>
-    <w:p>
-      <w:pPr>
-        <w:pStyle w:val="Heading1"/>
-      </w:pPr>
-      <w:r>
         <w:t xml:space="preserve">20. Recommended Production Improvements</w:t>
       </w:r>
     </w:p>
@@ -4305,7 +4007,7 @@
         <w:pStyle w:val="ListNumber"/>
       </w:pPr>
       <w:r>
-        <w:t xml:space="preserve">A secure backend and encrypted database.</w:t>
+        <w:t xml:space="preserve">An encrypted database if cross-device cycle synchronization is added.</w:t>
       </w:r>
     </w:p>
     <w:p>

</xml_diff>